<commit_message>
feat: decisao por volume de 5 min com saida em degraus de classe (item 56)
- base v4-volume (7 regras): volume observado e previsto, ocorrencia na
  hora; saida em degraus lidos de classe_iluminacao (P3 -> P4 -> P5)
- POST /eventos aceita item ou pacote; tipos volume e ocorrencia
  (encerrada ou prazo, o que vier primeiro); migracao 006
- suite convertida para volume de 5 min; ruido_na_fronteira volta
- painel: modal volume/ocorrencia e explicacao com o degrau
- texto: _SP_v4_revisado (marcado) e _SP_v4 (aceito), Quadro 18 da
  especificacao da interface, Figura 2 regenerada

Co-Authored-By: Claude Opus 5.5 <noreply@anthropic.com>
</commit_message>
<xml_diff>
--- a/Transicao_pre-projeto-para-TCC-Completo_TCC_Iluminacao_SP_v3.docx
+++ b/Transicao_pre-projeto-para-TCC-Completo_TCC_Iluminacao_SP_v3.docx
@@ -22978,7 +22978,7 @@
         </w:rPr>
         <w:drawing>
           <wp:inline distT="0" distB="0" distL="0" distR="0" wp14:anchorId="472F3386" wp14:editId="78D88793">
-            <wp:extent cx="5400000" cy="5088000"/>
+            <wp:extent cx="5400000" cy="4429213"/>
             <wp:effectExtent l="0" t="0" r="0" b="0"/>
             <wp:docPr id="102" name="Figura 2 - Diagrama entidade-relacionamento"/>
             <wp:cNvGraphicFramePr>
@@ -23000,7 +23000,7 @@
                   <pic:spPr>
                     <a:xfrm>
                       <a:off x="0" y="0"/>
-                      <a:ext cx="5400000" cy="5088000"/>
+                      <a:ext cx="5400000" cy="4429213"/>
                     </a:xfrm>
                     <a:prstGeom prst="rect">
                       <a:avLst/>

</xml_diff>